<commit_message>
Update weekly report: AI scanning shipped, live camera scanner in scope
</commit_message>
<xml_diff>
--- a/IzyBrd_Weekly_Report_Jul2.docx
+++ b/IzyBrd_Weekly_Report_Jul2.docx
@@ -45,7 +45,7 @@
         <w:spacing w:after="120"/>
       </w:pPr>
       <w:r>
-        <w:t xml:space="preserve">Following the successful demo, this cycle focused on turning the prototype into a production-quality, multi-user product. The social and trust layers (comments, notifications, seller reviews) are now live on the real backend, the app is deployed to a shareable web link that stakeholders can try on their own devices, and the first version of the two flagship features on the product vision - the virtual wardrobe ("scan your clothes") and video listings - shipped this week.</w:t>
+        <w:t xml:space="preserve">Following the successful demo, this cycle focused on turning the prototype into a production-quality, multi-user product. The social and trust layers (comments, notifications, seller reviews) are live on the real backend, the app is deployed to a shareable web link that stakeholders can try on their own devices, and the flagship product-vision features shipped ahead of schedule: the virtual wardrobe with AI-powered garment scanning, and video listings.</w:t>
       </w:r>
     </w:p>
     <w:p>
@@ -150,10 +150,10 @@
           <w:b/>
           <w:bCs/>
         </w:rPr>
-        <w:t xml:space="preserve">Video listings (v1)</w:t>
-      </w:r>
-      <w:r>
-        <w:t xml:space="preserve"> - sellers can attach a short clip (up to 30 seconds) to a listing; the feed plays it muted and looping, TikTok-style, with photos as fallback.</w:t>
+        <w:t xml:space="preserve">AI garment scanning</w:t>
+      </w:r>
+      <w:r>
+        <w:t xml:space="preserve"> - scanning an item now runs it through an AI vision model (via a secure server function) that automatically fills in the garment’s title, style, color, and brand; the user adjusts and saves. Delivered ahead of the planned schedule and verified live.</w:t>
       </w:r>
     </w:p>
     <w:p>
@@ -170,10 +170,10 @@
           <w:b/>
           <w:bCs/>
         </w:rPr>
-        <w:t xml:space="preserve">Comments and activity notifications</w:t>
-      </w:r>
-      <w:r>
-        <w:t xml:space="preserve"> - live comments on listings and a real notifications feed (likes, comments, new followers, offers received) in the inbox, both updating in real time.</w:t>
+        <w:t xml:space="preserve">Video listings (v1)</w:t>
+      </w:r>
+      <w:r>
+        <w:t xml:space="preserve"> - sellers can attach a short clip (up to 30 seconds) to a listing; the feed plays it muted and looping, TikTok-style, with photos as fallback.</w:t>
       </w:r>
     </w:p>
     <w:p>
@@ -190,18 +190,10 @@
           <w:b/>
           <w:bCs/>
         </w:rPr>
-        <w:t xml:space="preserve">Deployment</w:t>
-      </w:r>
-      <w:r>
-        <w:t xml:space="preserve"> - the app is live on a shareable web link, with account creation open so stakeholders can explore independently.</w:t>
-      </w:r>
-    </w:p>
-    <w:p>
-      <w:pPr>
-        <w:pStyle w:val="Heading1"/>
-      </w:pPr>
-      <w:r>
-        <w:t xml:space="preserve">Product Direction (agreed this week)</w:t>
+        <w:t xml:space="preserve">Comments and activity notifications</w:t>
+      </w:r>
+      <w:r>
+        <w:t xml:space="preserve"> - live comments on listings and a real notifications feed (likes, comments, new followers, offers received) in the inbox, both updating in real time.</w:t>
       </w:r>
     </w:p>
     <w:p>
@@ -218,10 +210,18 @@
           <w:b/>
           <w:bCs/>
         </w:rPr>
-        <w:t xml:space="preserve">Video-first feed</w:t>
-      </w:r>
-      <w:r>
-        <w:t xml:space="preserve"> - the home feed becomes video-first. Listing photos move to the detail page as a gallery the buyer opens before purchasing.</w:t>
+        <w:t xml:space="preserve">Deployment</w:t>
+      </w:r>
+      <w:r>
+        <w:t xml:space="preserve"> - the app is live on a shareable web link, with account creation open so stakeholders can explore independently.</w:t>
+      </w:r>
+    </w:p>
+    <w:p>
+      <w:pPr>
+        <w:pStyle w:val="Heading1"/>
+      </w:pPr>
+      <w:r>
+        <w:t xml:space="preserve">Product Direction (agreed this week)</w:t>
       </w:r>
     </w:p>
     <w:p>
@@ -238,10 +238,30 @@
           <w:b/>
           <w:bCs/>
         </w:rPr>
-        <w:t xml:space="preserve">Smarter scanning</w:t>
-      </w:r>
-      <w:r>
-        <w:t xml:space="preserve"> - scanning an item captures the garment plus its details (brand, size, etc.) into the virtual wardrobe; AI-assisted auto-tagging of style and color is the planned next step.</w:t>
+        <w:t xml:space="preserve">Video-first feed</w:t>
+      </w:r>
+      <w:r>
+        <w:t xml:space="preserve"> - the home feed becomes video-first. Listing photos move to the detail page as a gallery the buyer opens before purchasing.</w:t>
+      </w:r>
+    </w:p>
+    <w:p>
+      <w:pPr>
+        <w:pStyle w:val="ListParagraph"/>
+        <w:numPr>
+          <w:ilvl w:val="0"/>
+          <w:numId w:val="2"/>
+        </w:numPr>
+        <w:spacing w:after="60"/>
+      </w:pPr>
+      <w:r>
+        <w:rPr>
+          <w:b/>
+          <w:bCs/>
+        </w:rPr>
+        <w:t xml:space="preserve">Live camera scanning</w:t>
+      </w:r>
+      <w:r>
+        <w:t xml:space="preserve"> - beyond photo scanning (shipped), the next step is a live camera mode: point the camera at a garment and the app identifies it in real time, then saves it to the virtual wardrobe with one tap.</w:t>
       </w:r>
     </w:p>
     <w:p>
@@ -403,7 +423,7 @@
                 <w:sz w:val="20"/>
                 <w:szCs w:val="20"/>
               </w:rPr>
-              <w:t xml:space="preserve">Smarter scanning: wardrobe item details (brand, size, color) and AI auto-tagging from the photo.</w:t>
+              <w:t xml:space="preserve">Video-first feed and multi-photo galleries on the listing detail page (moved up - AI scanning shipped early).</w:t>
             </w:r>
           </w:p>
         </w:tc>
@@ -463,7 +483,7 @@
                 <w:sz w:val="20"/>
                 <w:szCs w:val="20"/>
               </w:rPr>
-              <w:t xml:space="preserve">Video-first feed and multi-photo galleries on the listing detail page.</w:t>
+              <w:t xml:space="preserve">Live camera scanner: a viewfinder that identifies the garment as you point the camera, then saves it to the wardrobe in one tap.</w:t>
             </w:r>
           </w:p>
         </w:tc>
@@ -663,7 +683,7 @@
         <w:spacing w:after="120"/>
       </w:pPr>
       <w:r>
-        <w:t xml:space="preserve">IzyBrd is a working multi-user marketplace: account creation and onboarding, a vertical discovery feed with video support, listings with photos and stories, offers and checkout with orders, real-time chat, comments, follows, likes and saves, search, activity notifications, seller reviews, editable profiles with avatars, and a private virtual wardrobe - all running on a secured backend (per-user data access rules) and deployed to a shareable web link.</w:t>
+        <w:t xml:space="preserve">IzyBrd is a working multi-user marketplace: account creation and onboarding, a vertical discovery feed with video support, listings with photos and stories, offers and checkout with orders, real-time chat, comments, follows, likes and saves, search, activity notifications, seller reviews, editable profiles with avatars, and a private virtual wardrobe with AI garment scanning - all running on a secured backend (per-user data access rules) and deployed to a shareable web link.</w:t>
       </w:r>
     </w:p>
     <w:sectPr>
@@ -1067,22 +1087,5 @@
       <w:szCs w:val="32"/>
     </w:rPr>
   </w:style>
-  <w:style w:type="paragraph" w:styleId="Heading2">
-    <w:name w:val="Heading 2"/>
-    <w:basedOn w:val="Normal"/>
-    <w:next w:val="Normal"/>
-    <w:qFormat/>
-    <w:pPr>
-      <w:spacing w:after="120" w:before="200"/>
-      <w:outlineLvl w:val="1"/>
-    </w:pPr>
-    <w:rPr>
-      <w:rFonts w:ascii="Arial" w:cs="Arial" w:eastAsia="Arial" w:hAnsi="Arial"/>
-      <w:b/>
-      <w:bCs/>
-      <w:sz w:val="26"/>
-      <w:szCs w:val="26"/>
-    </w:rPr>
-  </w:style>
 </w:styles>
 </file>
</xml_diff>